<commit_message>
docs(lab3): insert runtime evidence screenshots
</commit_message>
<xml_diff>
--- a/实验三_DevOps流水线与容器化部署/D3-1_DevOps设计方案.docx
+++ b/实验三_DevOps流水线与容器化部署/D3-1_DevOps设计方案.docx
@@ -1219,7 +1219,7 @@
             <w:r>
               <w:drawing>
                 <wp:inline xmlns:a="http://schemas.openxmlformats.org/drawingml/2006/main" xmlns:pic="http://schemas.openxmlformats.org/drawingml/2006/picture">
-                  <wp:extent cx="5349240" cy="3122800"/>
+                  <wp:extent cx="5715000" cy="3048888"/>
                   <wp:docPr id="1" name="Picture 1"/>
                   <wp:cNvGraphicFramePr>
                     <a:graphicFrameLocks noChangeAspect="1"/>
@@ -1228,11 +1228,11 @@
                     <a:graphicData uri="http://schemas.openxmlformats.org/drawingml/2006/picture">
                       <pic:pic>
                         <pic:nvPicPr>
-                          <pic:cNvPr id="0" name="image.png"/>
+                          <pic:cNvPr id="0" name="3-1.png"/>
                           <pic:cNvPicPr/>
                         </pic:nvPicPr>
                         <pic:blipFill>
-                          <a:blip r:embed="rId11"/>
+                          <a:blip r:embed="rId12"/>
                           <a:stretch>
                             <a:fillRect/>
                           </a:stretch>
@@ -1240,7 +1240,7 @@
                         <pic:spPr>
                           <a:xfrm>
                             <a:off x="0" y="0"/>
-                            <a:ext cx="5349240" cy="3122800"/>
+                            <a:ext cx="5715000" cy="3048888"/>
                           </a:xfrm>
                           <a:prstGeom prst="rect"/>
                         </pic:spPr>
@@ -1256,6 +1256,9 @@
               <w:jc w:val="center"/>
             </w:pPr>
             <w:r>
+              <w:rPr>
+                <w:i/>
+              </w:rPr>
               <w:t>图3-1 DevOps 流水线总体图</w:t>
             </w:r>
           </w:p>

</xml_diff>